<commit_message>
Add DOCX extraction: XML walker, table/header-aware Line[] (Phase 2)
</commit_message>
<xml_diff>
--- a/src/importer/__tests__/fixtures/003-word-table-layout.docx
+++ b/src/importer/__tests__/fixtures/003-word-table-layout.docx
@@ -25,7 +25,7 @@
           <w:b w:val="false"/>
           <w:bCs w:val="false"/>
         </w:rPr>
-        <w:t xml:space="preserve">priya.nair@example.com | +44 20 7946 0958 | London, UK</w:t>
+        <w:t xml:space="preserve">London, UK</w:t>
       </w:r>
     </w:p>
     <w:p>
@@ -337,6 +337,7 @@
       </w:r>
     </w:p>
     <w:sectPr>
+      <w:headerReference w:type="default" r:id="rId7"/>
       <w:pgSz w:w="11906" w:h="16838" w:orient="portrait"/>
       <w:pgMar w:top="1440" w:right="1440" w:bottom="1440" w:left="1440" w:header="708" w:footer="708" w:gutter="0"/>
       <w:pgNumType/>
@@ -422,6 +423,20 @@
     </w:p>
   </w:footnote>
 </w:footnotes>
+</file>
+
+<file path=word/header1.xml><?xml version="1.0" encoding="utf-8"?>
+<w:hdr xmlns:wpc="http://schemas.microsoft.com/office/word/2010/wordprocessingCanvas" xmlns:mc="http://schemas.openxmlformats.org/markup-compatibility/2006" xmlns:o="urn:schemas-microsoft-com:office:office" xmlns:r="http://schemas.openxmlformats.org/officeDocument/2006/relationships" xmlns:m="http://schemas.openxmlformats.org/officeDocument/2006/math" xmlns:v="urn:schemas-microsoft-com:vml" xmlns:wp14="http://schemas.microsoft.com/office/word/2010/wordprocessingDrawing" xmlns:wp="http://schemas.openxmlformats.org/drawingml/2006/wordprocessingDrawing" xmlns:w10="urn:schemas-microsoft-com:office:word" xmlns:w="http://schemas.openxmlformats.org/wordprocessingml/2006/main" xmlns:w14="http://schemas.microsoft.com/office/word/2010/wordml" xmlns:w15="http://schemas.microsoft.com/office/word/2012/wordml" xmlns:wpg="http://schemas.microsoft.com/office/word/2010/wordprocessingGroup" xmlns:wpi="http://schemas.microsoft.com/office/word/2010/wordprocessingInk" xmlns:wne="http://schemas.microsoft.com/office/word/2006/wordml" xmlns:wps="http://schemas.microsoft.com/office/word/2010/wordprocessingShape" xmlns:cx="http://schemas.microsoft.com/office/drawing/2014/chartex" xmlns:cx1="http://schemas.microsoft.com/office/drawing/2015/9/8/chartex" xmlns:cx2="http://schemas.microsoft.com/office/drawing/2015/10/21/chartex" xmlns:cx3="http://schemas.microsoft.com/office/drawing/2016/5/9/chartex" xmlns:cx4="http://schemas.microsoft.com/office/drawing/2016/5/10/chartex" xmlns:cx5="http://schemas.microsoft.com/office/drawing/2016/5/11/chartex" xmlns:cx6="http://schemas.microsoft.com/office/drawing/2016/5/12/chartex" xmlns:cx7="http://schemas.microsoft.com/office/drawing/2016/5/13/chartex" xmlns:cx8="http://schemas.microsoft.com/office/drawing/2016/5/14/chartex" xmlns:w16cid="http://schemas.microsoft.com/office/word/2016/wordml/cid" xmlns:w16se="http://schemas.microsoft.com/office/word/2015/wordml/symex">
+  <w:p>
+    <w:r>
+      <w:rPr>
+        <w:b w:val="false"/>
+        <w:bCs w:val="false"/>
+      </w:rPr>
+      <w:t xml:space="preserve">priya.nair@example.com | +44 20 7946 0958</w:t>
+    </w:r>
+  </w:p>
+</w:hdr>
 </file>
 
 <file path=word/numbering.xml><?xml version="1.0" encoding="utf-8"?>

</xml_diff>